<commit_message>
Lot 14b : minuscule de l'article initial dans « Ce que les élèves doivent repérer »
Quand ce champ (E11_CIBLE à E22_CIBLE) est laissé vide, il est prérempli
depuis le nom de l'entrée, qui porte une majuscule initiale. Inséré en
milieu de phrase, il donnait « les indices concernant Le type de texte ».

L'article initial (Le, La, Les, L', Un, Une, Des, Du, De, D') passe en
minuscule, seulement s'il est suivi d'un mot en minuscule : « La Fontaine »
et « L'Étranger » restent intacts. Une valeur saisie par l'enseignant
n'est jamais modifiée. Le nom de l'entrée garde sa majuscule partout où il
sert de titre (tableau de vérification, « Axe 1, entrée 1 : »).

Docx et PDF de contrôle régénérés avec les mêmes valeurs factices : seules
la date et les 4 phrases concernées changent ; squelette XML identique.

Co-Authored-By: Claude Opus 5.5 <noreply@anthropic.com>
Claude-Session: https://claude.ai/code/session_01X3fe2WzhpZZajDSR6y2Xvc
</commit_message>
<xml_diff>
--- a/test-output/fiche_S4_controle.docx
+++ b/test-output/fiche_S4_controle.docx
@@ -139,7 +139,7 @@
                 <w:sz w:val="20"/>
                 <w:szCs w:val="20"/>
               </w:rPr>
-              <w:t xml:space="preserve">13/10/2026</w:t>
+              <w:t xml:space="preserve">20/10/2026</w:t>
             </w:r>
           </w:p>
         </w:tc>
@@ -1974,7 +1974,7 @@
                 <w:sz w:val="20"/>
                 <w:szCs w:val="20"/>
               </w:rPr>
-              <w:t xml:space="preserve">- Demande : « Relève dans le texte les indices concernant Le type de texte. »</w:t>
+              <w:t xml:space="preserve">- Demande : « Relève dans le texte les indices concernant le type de texte. »</w:t>
             </w:r>
           </w:p>
           <w:p>
@@ -2034,7 +2034,7 @@
                 <w:sz w:val="20"/>
                 <w:szCs w:val="20"/>
               </w:rPr>
-              <w:t xml:space="preserve">- Demande : « Relève dans le texte les indices concernant Les outils grammaticaux pertinents. »</w:t>
+              <w:t xml:space="preserve">- Demande : « Relève dans le texte les indices concernant les outils grammaticaux pertinents. »</w:t>
             </w:r>
           </w:p>
           <w:p>
@@ -2109,7 +2109,7 @@
                 <w:sz w:val="20"/>
                 <w:szCs w:val="20"/>
               </w:rPr>
-              <w:t xml:space="preserve">- Demande : « Relève dans le texte les indices concernant Les indices lexicaux pertinents. »</w:t>
+              <w:t xml:space="preserve">- Demande : « Relève dans le texte les indices concernant les indices lexicaux pertinents. »</w:t>
             </w:r>
           </w:p>
           <w:p>
@@ -2919,7 +2919,7 @@
                 <w:sz w:val="20"/>
                 <w:szCs w:val="20"/>
               </w:rPr>
-              <w:t xml:space="preserve">Identifie dans le passage les indices concernant Les personnages et les thèmes majeurs.</w:t>
+              <w:t xml:space="preserve">Identifie dans le passage les indices concernant les personnages et les thèmes majeurs.</w:t>
             </w:r>
           </w:p>
           <w:p>

</xml_diff>